<commit_message>
Update - Finished French translation of rulebook
</commit_message>
<xml_diff>
--- a/rulebooks/one_dnd_rulebook_en.docx
+++ b/rulebooks/one_dnd_rulebook_en.docx
@@ -3836,7 +3836,15 @@
         <w:t xml:space="preserve">If the new tile contains a Teleportation Gate (TG) and there are more TGs in the dungeon, the player can move between them, spending only one move to teleport from the neighbouring tile into the other side of the </w:t>
       </w:r>
       <w:r>
-        <w:t>gate, or from its own tile to the a neighbouring tile on the other side of the gate</w:t>
+        <w:t xml:space="preserve">gate, or from its own tile to </w:t>
+      </w:r>
+      <w:proofErr w:type="gramStart"/>
+      <w:r>
+        <w:t>the a</w:t>
+      </w:r>
+      <w:proofErr w:type="gramEnd"/>
+      <w:r>
+        <w:t xml:space="preserve"> neighbouring tile on the other side of the gate</w:t>
       </w:r>
       <w:r>
         <w:t>.</w:t>
@@ -4630,7 +4638,19 @@
     </w:p>
     <w:p>
       <w:r>
-        <w:t xml:space="preserve">Remember, Lady Lorraine’s bear companion is not a </w:t>
+        <w:t xml:space="preserve">Remember, Lady Lorraine’s </w:t>
+      </w:r>
+      <w:r>
+        <w:t>B</w:t>
+      </w:r>
+      <w:r>
+        <w:t xml:space="preserve">ear </w:t>
+      </w:r>
+      <w:r>
+        <w:t>C</w:t>
+      </w:r>
+      <w:r>
+        <w:t xml:space="preserve">ompanion is not a </w:t>
       </w:r>
       <w:r>
         <w:t>f</w:t>
@@ -9846,7 +9866,7 @@
         <w:t xml:space="preserve">The Attack Modifier is added to attack rolls to see if the attack lands. On a success, the Damage Modifier is added to the </w:t>
       </w:r>
       <w:r>
-        <w:t>V</w:t>
+        <w:t>B</w:t>
       </w:r>
       <w:r>
         <w:t xml:space="preserve">ase attack or </w:t>
@@ -12166,7 +12186,15 @@
               <w:t xml:space="preserve"> the monster or </w:t>
             </w:r>
             <w:r>
-              <w:t>he can make</w:t>
+              <w:t xml:space="preserve">he </w:t>
+            </w:r>
+            <w:proofErr w:type="gramStart"/>
+            <w:r>
+              <w:t>can</w:t>
+            </w:r>
+            <w:proofErr w:type="gramEnd"/>
+            <w:r>
+              <w:t xml:space="preserve"> make</w:t>
             </w:r>
             <w:r>
               <w:t xml:space="preserve"> a singular additional Base attack if the Monster survived.</w:t>
@@ -13052,7 +13080,13 @@
         <w:t>Up-cast</w:t>
       </w:r>
       <w:r>
-        <w:t xml:space="preserve"> – The attack is rolled with advantage.</w:t>
+        <w:t xml:space="preserve"> – The </w:t>
+      </w:r>
+      <w:r>
+        <w:t>spell works on targets with WIS +2 or lower</w:t>
+      </w:r>
+      <w:r>
+        <w:t>.</w:t>
       </w:r>
       <w:r>
         <w:br w:type="page"/>
@@ -13846,7 +13880,7 @@
       </w:r>
       <w:proofErr w:type="spellEnd"/>
       <w:r>
-        <w:t xml:space="preserve"> deals 1d6 + WIS Fire damage.</w:t>
+        <w:t xml:space="preserve"> deals 1d6 + WIS damage.</w:t>
       </w:r>
     </w:p>
     <w:p>
@@ -14814,12 +14848,15 @@
         <w:t xml:space="preserve"> can </w:t>
       </w:r>
       <w:r>
-        <w:t xml:space="preserve">also </w:t>
+        <w:t xml:space="preserve">still </w:t>
       </w:r>
       <w:r>
         <w:t>make an attack with it</w:t>
       </w:r>
       <w:r>
+        <w:t xml:space="preserve"> this turn</w:t>
+      </w:r>
+      <w:r>
         <w:t>.</w:t>
       </w:r>
     </w:p>
@@ -14833,7 +14870,19 @@
     </w:p>
     <w:p>
       <w:r>
-        <w:t xml:space="preserve">Taia summons a familiar from to list the fight at her side. </w:t>
+        <w:t xml:space="preserve">Taia summons a familiar from </w:t>
+      </w:r>
+      <w:r>
+        <w:t>the</w:t>
+      </w:r>
+      <w:r>
+        <w:t xml:space="preserve"> list </w:t>
+      </w:r>
+      <w:r>
+        <w:t xml:space="preserve">to </w:t>
+      </w:r>
+      <w:r>
+        <w:t xml:space="preserve">fight at her side. </w:t>
       </w:r>
       <w:r>
         <w:rPr>
@@ -14859,7 +14908,13 @@
         <w:t>Make a regular attack roll. On a success, Taia d</w:t>
       </w:r>
       <w:r>
-        <w:t xml:space="preserve">eals 2d6 + WIS damage and has advantage on her next attack against the target. </w:t>
+        <w:t xml:space="preserve">eals 2d6 + WIS </w:t>
+      </w:r>
+      <w:r>
+        <w:t xml:space="preserve">Fire </w:t>
+      </w:r>
+      <w:r>
+        <w:t xml:space="preserve">damage and has advantage on her next attack against the target. </w:t>
       </w:r>
       <w:r>
         <w:rPr>
@@ -17168,11 +17223,9 @@
       <w:r>
         <w:t xml:space="preserve">, the </w:t>
       </w:r>
-      <w:proofErr w:type="spellStart"/>
-      <w:r>
-        <w:t>Bersker</w:t>
-      </w:r>
-      <w:proofErr w:type="spellEnd"/>
+      <w:r>
+        <w:t>Berserker</w:t>
+      </w:r>
       <w:r>
         <w:t xml:space="preserve"> (Regent)</w:t>
       </w:r>
@@ -20358,7 +20411,15 @@
     </w:p>
     <w:p>
       <w:r>
-        <w:t xml:space="preserve">Lady Lorraine summons a familiar from to list the fight at her side. </w:t>
+        <w:t xml:space="preserve">Lady Lorraine </w:t>
+      </w:r>
+      <w:proofErr w:type="gramStart"/>
+      <w:r>
+        <w:t>summons</w:t>
+      </w:r>
+      <w:proofErr w:type="gramEnd"/>
+      <w:r>
+        <w:t xml:space="preserve"> a familiar from to list the fight at her side. </w:t>
       </w:r>
       <w:r>
         <w:rPr>
@@ -20394,7 +20455,13 @@
         <w:t xml:space="preserve"> – </w:t>
       </w:r>
       <w:r>
-        <w:t>The prey takes an</w:t>
+        <w:t xml:space="preserve">The </w:t>
+      </w:r>
+      <w:r>
+        <w:t>P</w:t>
+      </w:r>
+      <w:r>
+        <w:t>rey takes an</w:t>
       </w:r>
       <w:r>
         <w:t xml:space="preserve"> additional 1d4 + 1 damage instead.</w:t>

</xml_diff>